<commit_message>
Reword review in viewer voice
Co-Authored-By: Claude Opus 5.5 <noreply@anthropic.com>
Claude-Session: https://claude.ai/code/session_019ERZcwfmD8YiCFtxxvJ2Gg
</commit_message>
<xml_diff>
--- a/owasp-roleplay-review/review.docx
+++ b/owasp-roleplay-review/review.docx
@@ -459,7 +459,7 @@
           <w:b w:val="0"/>
           <w:bCs w:val="0"/>
         </w:rPr>
-        <w:t xml:space="preserve"> เปิดประชุมได้ชัดด้วย "สามอย่าง" (ธุรกิจโตเร็ว ช่องโหว่ขยายผลห้าเท่า และข้อมูลอยู่ใต้ PDPA) วาง ground rules สามข้อ และสรุปปิดท้ายทุกช่วง เช่น checkpoint หกข้อตอนครบชั่วโมงแรก และการทวนสรุปช่วง Crypto ทำให้คนดูตามทันว่าตกลงอะไรกันไปแล้ว</w:t>
+        <w:t xml:space="preserve"> เปิดประชุมได้ชัดด้วย "สามอย่าง" (ธุรกิจโตเร็ว ช่องโหว่ขยายผลห้าเท่า และข้อมูลอยู่ใต้ PDPA) วาง ground rules สามข้อ และสรุปปิดท้ายทุกช่วง เช่น checkpoint หกข้อตอนครบชั่วโมงแรก และการทวนสรุปช่วง Crypto ทำให้คนดูคลิปตามทันว่าตกลงอะไรกันไปแล้ว</w:t>
       </w:r>
     </w:p>
     <w:p>
@@ -482,7 +482,7 @@
           <w:b w:val="0"/>
           <w:bCs w:val="0"/>
         </w:rPr>
-        <w:t xml:space="preserve"> เล่นบท CTO ได้สมจริง คือคัดค้านด้วยเหตุผลทางธุรกิจ เช่น "ถ้าทุก feature ต้องมี workshop ผมรับไม่ได้" และ "ถ้า build ล้มเพราะช่องโหว่ที่ยังไม่มี patch... ผมรับไม่ได้" แล้วต่อรองจนได้ข้อสรุปที่ทำได้จริง เช่น แบ่ง MFA เป็นสองเฟส และจัดลำดับ SCA ก่อน image signing ช่วง ad-lib ยอมรับว่า "ทีมผมเขียนเอง ผมเป็นคนอนุมัติ requirement" ทำให้ตัวละครมีมิติ ปิดด้วยตาราง Action Items 15 ข้อที่มี owner และกำหนดเสร็จ</w:t>
+        <w:t xml:space="preserve"> เล่นบท CTO ได้สมจริง คือคัดค้านด้วยเหตุผลทางธุรกิจ เช่น "ถ้าทุก feature ต้องมี workshop ผมรับไม่ได้" และ "ถ้า build ล้มเพราะช่องโหว่ที่ยังไม่มี patch... ผมรับไม่ได้" แล้วต่อรองจนได้ข้อสรุปที่ทำได้จริง เช่น แบ่ง MFA เป็นสองเฟส และจัดลำดับ SCA ก่อน image signing ตอนคุยถึงที่มาของ IDOR ก็ยอมรับตรงๆ ว่า "ทีมผมเขียนเอง ผมเป็นคนอนุมัติ requirement" ทำให้ตัวละครมีมิติ ไม่ได้เป็นแค่คนค้าน ปิดด้วยตาราง Action Items 15 ข้อที่มี owner และกำหนดเสร็จ</w:t>
       </w:r>
     </w:p>
     <w:p>
@@ -574,7 +574,7 @@
           <w:b w:val="0"/>
           <w:bCs w:val="0"/>
         </w:rPr>
-        <w:t xml:space="preserve"> มีจุดเด่นที่อธิบาย IDOR ให้เข้าใจง่าย ("ถ้าแฮกเกอร์รู้ว่าเปลี่ยนเลข ID... ดึงข้อมูลคนอื่นได้") และใช้อุปมา "ล็อกประตูแล้วแขวนกุญแจไว้ข้างๆ" แต่หลายช่วงพูดเป็นรายการยาวต่อเนื่อง (ข้อเสนอห้าข้อเรื่อง CI/CD, สี่ข้อเรื่อง logging) ซึ่งฟังทางเสียงแล้วจำได้ยาก ควรเขียนบนไวท์บอร์ดประกอบหรือแบ่งพูดเป็นช่วงสั้นลง</w:t>
+        <w:t xml:space="preserve"> มีจุดเด่นที่อธิบาย IDOR ให้เข้าใจง่าย ("ถ้าแฮกเกอร์รู้ว่าเปลี่ยนเลข ID... ดึงข้อมูลคนอื่นได้") และใช้อุปมา "ล็อกประตูแล้วแขวนกุญแจไว้ข้างๆ" แต่หลายช่วงพูดเป็นรายการยาวต่อเนื่อง (ข้อเสนอห้าข้อเรื่อง CI/CD, สี่ข้อเรื่อง logging) ฟังแล้วตามได้ยากและจำไม่ค่อยได้ ควรเขียนบนไวท์บอร์ดประกอบหรือแบ่งพูดเป็นช่วงสั้นลง</w:t>
       </w:r>
     </w:p>
     <w:p>
@@ -597,7 +597,7 @@
           <w:b w:val="0"/>
           <w:bCs w:val="0"/>
         </w:rPr>
-        <w:t xml:space="preserve"> เตรียมรับข้อโต้แย้งไว้ล่วงหน้า เช่น "ผมคิดเรื่องนี้ไว้แล้วครับ เตรียมกลไก exception..." และยอมประนีประนอมแบบ risk-based แต่ไม่ยอมทุกเรื่อง (ยืนให้ secret scanning "เปิดทันทีในสัปดาห์นี้") การสลับมาเป็นผู้ยิง inject สามรอบ (23:10, 00:30, 09:00 น.) ทำให้ช่วง Incident Response สมจริงมาก หักคะแนนเพราะบทส่วนใหญ่ยังเป็นการบรรยายฝ่ายเดียว จึงดูเหมือนสอนมากกว่าประชุมในบางช่วง</w:t>
+        <w:t xml:space="preserve"> เตรียมรับข้อโต้แย้งไว้ล่วงหน้า เช่น "ผมคิดเรื่องนี้ไว้แล้วครับ เตรียมกลไก exception..." และยอมประนีประนอมแบบ risk-based แต่ไม่ยอมทุกเรื่อง (ยืนให้ secret scanning "เปิดทันทีในสัปดาห์นี้") การสลับมาเป็นผู้ยิง inject สามรอบ (23:10, 00:30, 09:00 น.) ทำให้ช่วง Incident Response สมจริงมาก หักคะแนนเพราะหลายช่วงเป็นการบรรยายฝ่ายเดียวยาวๆ ฟังแล้วเหมือนสอนมากกว่าประชุม</w:t>
       </w:r>
     </w:p>
     <w:p>

</xml_diff>